<commit_message>
Add Unit 9: Ship, Document & Demonstrate; syllabus calendar update
Co-Authored-By: Claude Opus 5 <noreply@anthropic.com>
</commit_message>
<xml_diff>
--- a/Courses/145065/_source/MCCTC_145065_Object-Oriented_Programming_Syllabus_2026-2027.docx
+++ b/Courses/145065/_source/MCCTC_145065_Object-Oriented_Programming_Syllabus_2026-2027.docx
@@ -9882,7 +9882,7 @@
                 <w:sz w:val="17"/>
                 <w:szCs w:val="17"/>
               </w:rPr>
-              <w:t xml:space="preserve">Documentation and handoff. A non-technical operator uses it.</w:t>
+              <w:t xml:space="preserve">Documentation, user guide, baseline tag, and handoff.</w:t>
             </w:r>
           </w:p>
         </w:tc>
@@ -9968,7 +9968,7 @@
                 <w:sz w:val="17"/>
                 <w:szCs w:val="17"/>
               </w:rPr>
-              <w:t xml:space="preserve">Final demonstrations. GP4 ENDS.</w:t>
+              <w:t xml:space="preserve">Non-technical operator test, final demonstrations. GP4 ENDS.</w:t>
             </w:r>
           </w:p>
         </w:tc>

</xml_diff>